<commit_message>
Remove em-dashes from all documents; regenerate PDFs
Replace em-dashes (and spaced en-dashes used as clause separators) with commas across
the technical paper, manuscript, response letter, supplementary, COMBINED bundle and
the dissertation, so the prose no longer relies on dashes. Hyphens in ranges are kept.
PDFs and the dissertation table of contents regenerated. _strip_dashes.py added.
</commit_message>
<xml_diff>
--- a/AUTHOR_RESPONSE_LETTER.docx
+++ b/AUTHOR_RESPONSE_LETTER.docx
@@ -7,7 +7,7 @@
         <w:pStyle w:val="Title"/>
       </w:pPr>
       <w:r>
-        <w:t>Response to Reviewers — Manuscript SO-26-5308 (R1)</w:t>
+        <w:t>Response to Reviewers, Manuscript SO-26-5308 (R1)</w:t>
       </w:r>
     </w:p>
     <w:p>
@@ -15,7 +15,7 @@
         <w:jc w:val="both"/>
       </w:pPr>
       <w:r>
-        <w:t>We thank the editor and both reviewers for a careful and constructive reading. The revision makes four substantive additions in direct response: (1) we implement and empirically evaluate a semantic-equivalence quorum, so the central claim is now demonstrated rather than deferred; (2) we add a cross-language evaluation on Java, including the real Defects4J harness with its actual JUnit test oracle; (3) we demonstrate the Byzantine fault tolerance of the consensus layer directly — independent replicas exchanging signed messages over an asynchronous, partitionable network preserve agreement under a malicious, equivocating primary where naive voting splits (Section 6.14) — together with run-to-run variance and latency analyses; and (4) we add a full reproduction protocol with exact models, seeds, prompts and a Docker definition. Point-by-point responses follow; section and table numbers refer to the revised manuscript. All changes are visible in the tracked-changes copy.</w:t>
+        <w:t>We thank the editor and both reviewers for a careful and constructive reading. The revision makes four substantive additions in direct response: (1) we implement and empirically evaluate a semantic-equivalence quorum, so the central claim is now demonstrated rather than deferred; (2) we add a cross-language evaluation on Java, including the real Defects4J harness with its actual JUnit test oracle; (3) we demonstrate the Byzantine fault tolerance of the consensus layer directly, independent replicas exchanging signed messages over an asynchronous, partitionable network preserve agreement under a malicious, equivocating primary where naive voting splits (Section 6.14), together with run-to-run variance and latency analyses; and (4) we add a full reproduction protocol with exact models, seeds, prompts and a Docker definition. Point-by-point responses follow; section and table numbers refer to the revised manuscript. All changes are visible in the tracked-changes copy.</w:t>
       </w:r>
     </w:p>
     <w:p>
@@ -142,7 +142,7 @@
         <w:t>two genuine, full-suite-verified repairs (Math-3, unanimous 4-of-4; Math-5, 3-of-4 with one validator dissenting on a fix that nevertheless passed the real suite)</w:t>
       </w:r>
       <w:r>
-        <w:t xml:space="preserve">, with consensus reached on all 9 evaluated bugs. On commons-lang the four independent validators reached consensus on 8 of 9 evaluated bugs, but none passed the full Lang suite — a concrete, honest measure of how hard real-world Java repair is, and in every case the executable suite prevented an unverified fix from being reported as a repair (Table 10). The real oracle cleanly separates two questions the synthetic and snippet-level studies cannot: </w:t>
+        <w:t xml:space="preserve">, with consensus reached on all 9 evaluated bugs. On commons-lang the four independent validators reached consensus on 8 of 9 evaluated bugs, but none passed the full Lang suite, a concrete, honest measure of how hard real-world Java repair is, and in every case the executable suite prevented an unverified fix from being reported as a repair (Table 10). The real oracle cleanly separates two questions the synthetic and snippet-level studies cannot: </w:t>
       </w:r>
       <w:r>
         <w:rPr>
@@ -289,7 +289,7 @@
         <w:t>3. Repeatability and reliability.</w:t>
       </w:r>
       <w:r>
-        <w:t xml:space="preserve"> Added a reproduction section (Section 5.9) with exact model strings — analyzer claude-sonnet-4-5-20250929 (temperature 0.3, no vote), healer/ proposer gpt-4o (0.7, no vote), and the four independent validators (Claude-Haiku and GPT-4o-mini in the cloud, llama3.1:8b and mistral:7b served locally by Ollama, all at 0.1) — with token budgets, timeouts and seed handling (we pin seeds for OpenAI and Ollama; Anthropic exposes none). The Docker sandbox image and limits are specified. A supplementary file gives the full command sequence, the verbatim agent prompts, and a BugsInPy case-to- project mapping. On single-run-per-bug: we add a variance study repeating a ten-bug subset three times (Section 6.11). The consensus pipeline was identical across all three runs (success 1.000, zero safety violations); only the single-agent baseline's raw success moved (1.00, 1.00, 0.90), so the outcomes the safety claim rests on do not vary run to run. Test adequacy: the synthetic and e-commerce canonical fixes were each verified by hand against the bundled assertion suite.</w:t>
+        <w:t xml:space="preserve"> Added a reproduction section (Section 5.9) with exact model strings, analyzer claude-sonnet-4-5-20250929 (temperature 0.3, no vote), healer/ proposer gpt-4o (0.7, no vote), and the four independent validators (Claude-Haiku and GPT-4o-mini in the cloud, llama3.1:8b and mistral:7b served locally by Ollama, all at 0.1), with token budgets, timeouts and seed handling (we pin seeds for OpenAI and Ollama; Anthropic exposes none). The Docker sandbox image and limits are specified. A supplementary file gives the full command sequence, the verbatim agent prompts, and a BugsInPy case-to- project mapping. On single-run-per-bug: we add a variance study repeating a ten-bug subset three times (Section 6.11). The consensus pipeline was identical across all three runs (success 1.000, zero safety violations); only the single-agent baseline's raw success moved (1.00, 1.00, 0.90), so the outcomes the safety claim rests on do not vary run to run. Test adequacy: the synthetic and e-commerce canonical fixes were each verified by hand against the bundled assertion suite.</w:t>
       </w:r>
     </w:p>
     <w:p>
@@ -370,7 +370,7 @@
         <w:t>votes</w:t>
       </w:r>
       <w:r>
-        <w:t xml:space="preserve">, which a majority quorum masks — useful, but not by itself the defining Byzantine property. To demonstrate that property we built an independent-replica realisation of the protocol: four replicas exchanging Ed25519-signed pre-prepare/prepare/commit messages over an asynchronous, partitionable network, and we pit it against a naive proposal-trust scheme. Under a </w:t>
+        <w:t xml:space="preserve">, which a majority quorum masks, useful, but not by itself the defining Byzantine property. To demonstrate that property we built an independent-replica realisation of the protocol: four replicas exchanging Ed25519-signed pre-prepare/prepare/commit messages over an asynchronous, partitionable network, and we pit it against a naive proposal-trust scheme. Under a </w:t>
       </w:r>
       <w:r>
         <w:rPr>
@@ -379,7 +379,7 @@
         <w:t>malicious primary that equivocates</w:t>
       </w:r>
       <w:r>
-        <w:t xml:space="preserve"> (proposing fix X to some replicas and fix Y to others), the naive scheme splits — honest replicas commit different fixes (a safety violation) — while the protocol's 2f + 1 quorum certificates keep every honest replica in agreement (no split-brain). Forged messages are rejected (a replica cannot impersonate another, so one Byzantine node cannot manufacture a quorum), f = 1 crash is tolerated while f + 1 is not, and a partition blocks progress without ever causing a split, recovering on heal (Section 6.14, Table 13, Figure 7). The simulation is deterministic and uses no model calls. We are explicit that liveness under primary failure (view-change) and a multi-host deployment are implemented or designed but not yet evaluated (Section 8), and that the quality of the LLM repairs the protocol agrees on is a separate, preliminary question.</w:t>
+        <w:t xml:space="preserve"> (proposing fix X to some replicas and fix Y to others), the naive scheme splits, honest replicas commit different fixes (a safety violation), while the protocol's 2f + 1 quorum certificates keep every honest replica in agreement (no split-brain). Forged messages are rejected (a replica cannot impersonate another, so one Byzantine node cannot manufacture a quorum), f = 1 crash is tolerated while f + 1 is not, and a partition blocks progress without ever causing a split, recovering on heal (Section 6.14, Table 13, Figure 7). The simulation is deterministic and uses no model calls. We are explicit that liveness under primary failure (view-change) and a multi-host deployment are implemented or designed but not yet evaluated (Section 8), and that the quality of the LLM repairs the protocol agrees on is a separate, preliminary question.</w:t>
       </w:r>
     </w:p>
     <w:p>
@@ -476,7 +476,7 @@
         <w:t>distributed</w:t>
       </w:r>
       <w:r>
-        <w:t xml:space="preserve"> setting — real inter-host messaging, network partitions and view-change under primary failure (Section 8.5).</w:t>
+        <w:t xml:space="preserve"> setting, real inter-host messaging, network partitions and view-change under primary failure (Section 8.5).</w:t>
       </w:r>
     </w:p>
     <w:p>
@@ -590,6 +590,8 @@
       </w:r>
     </w:p>
     <w:sectPr>
+      <w:headerReference w:type="default" r:id="rId9"/>
+      <w:footerReference w:type="default" r:id="rId10"/>
       <w:pgSz w:w="12240" w:h="15840"/>
       <w:pgMar w:top="1417" w:right="1417" w:bottom="1417" w:left="1417" w:header="720" w:footer="720" w:gutter="0"/>
       <w:cols w:space="720"/>
@@ -597,6 +599,26 @@
     </w:sectPr>
   </w:body>
 </w:document>
+</file>
+
+<file path=word/footer1.xml><?xml version="1.0" encoding="utf-8"?>
+<w:ftr xmlns:m="http://schemas.openxmlformats.org/officeDocument/2006/math" xmlns:mc="http://schemas.openxmlformats.org/markup-compatibility/2006" xmlns:mo="http://schemas.microsoft.com/office/mac/office/2008/main" xmlns:mv="urn:schemas-microsoft-com:mac:vml" xmlns:o="urn:schemas-microsoft-com:office:office" xmlns:r="http://schemas.openxmlformats.org/officeDocument/2006/relationships" xmlns:v="urn:schemas-microsoft-com:vml" xmlns:w10="urn:schemas-microsoft-com:office:word" xmlns:w14="http://schemas.microsoft.com/office/word/2010/wordml" xmlns:w="http://schemas.openxmlformats.org/wordprocessingml/2006/main" xmlns:wne="http://schemas.microsoft.com/office/word/2006/wordml" xmlns:wp14="http://schemas.microsoft.com/office/word/2010/wordprocessingDrawing" xmlns:wp="http://schemas.openxmlformats.org/drawingml/2006/wordprocessingDrawing" xmlns:wpc="http://schemas.microsoft.com/office/word/2010/wordprocessingCanvas" xmlns:wpg="http://schemas.microsoft.com/office/word/2010/wordprocessingGroup" xmlns:wpi="http://schemas.microsoft.com/office/word/2010/wordprocessingInk" xmlns:wps="http://schemas.microsoft.com/office/word/2010/wordprocessingShape" mc:Ignorable="w14 wp14">
+  <w:p>
+    <w:pPr>
+      <w:pStyle w:val="Footer"/>
+    </w:pPr>
+  </w:p>
+</w:ftr>
+</file>
+
+<file path=word/header1.xml><?xml version="1.0" encoding="utf-8"?>
+<w:hdr xmlns:m="http://schemas.openxmlformats.org/officeDocument/2006/math" xmlns:mc="http://schemas.openxmlformats.org/markup-compatibility/2006" xmlns:mo="http://schemas.microsoft.com/office/mac/office/2008/main" xmlns:mv="urn:schemas-microsoft-com:mac:vml" xmlns:o="urn:schemas-microsoft-com:office:office" xmlns:r="http://schemas.openxmlformats.org/officeDocument/2006/relationships" xmlns:v="urn:schemas-microsoft-com:vml" xmlns:w10="urn:schemas-microsoft-com:office:word" xmlns:w14="http://schemas.microsoft.com/office/word/2010/wordml" xmlns:w="http://schemas.openxmlformats.org/wordprocessingml/2006/main" xmlns:wne="http://schemas.microsoft.com/office/word/2006/wordml" xmlns:wp14="http://schemas.microsoft.com/office/word/2010/wordprocessingDrawing" xmlns:wp="http://schemas.openxmlformats.org/drawingml/2006/wordprocessingDrawing" xmlns:wpc="http://schemas.microsoft.com/office/word/2010/wordprocessingCanvas" xmlns:wpg="http://schemas.microsoft.com/office/word/2010/wordprocessingGroup" xmlns:wpi="http://schemas.microsoft.com/office/word/2010/wordprocessingInk" xmlns:wps="http://schemas.microsoft.com/office/word/2010/wordprocessingShape" mc:Ignorable="w14 wp14">
+  <w:p>
+    <w:pPr>
+      <w:pStyle w:val="Header"/>
+    </w:pPr>
+  </w:p>
+</w:hdr>
 </file>
 
 <file path=word/numbering.xml><?xml version="1.0" encoding="utf-8"?>

</xml_diff>